<commit_message>
fix names on site: Zack-modifier -> Main-God modifier; million-year ring chip red in detail view too
</commit_message>
<xml_diff>
--- a/网页链接.docx
+++ b/网页链接.docx
@@ -9,70 +9,25 @@
         </w:rPr>
       </w:pPr>
       <w:r>
-        <w:rPr>
-          <w:rFonts w:hint="eastAsia"/>
-        </w:rPr>
-        <w:fldChar w:fldCharType="begin"/>
-      </w:r>
-      <w:r>
-        <w:instrText>HYPERLINK "https://zak-netizen-tech.github.io/zhu-shen-kong-jian/"</w:instrText>
+        <w:t>我的网页不见了，重新上传一下教程</w:t>
       </w:r>
       <w:r>
         <w:rPr>
           <w:rFonts w:hint="eastAsia"/>
         </w:rPr>
+        <w:t>:h</w:t>
       </w:r>
       <w:r>
-        <w:rPr>
-          <w:rFonts w:hint="eastAsia"/>
-        </w:rPr>
-        <w:fldChar w:fldCharType="separate"/>
+        <w:t>ttps://zak-netizen-tech.github.io/</w:t>
       </w:r>
+      <w:proofErr w:type="spellStart"/>
       <w:r>
-        <w:rPr>
-          <w:rStyle w:val="af2"/>
-        </w:rPr>
-        <w:t>httpszak-netizen-</w:t>
+        <w:t>zhu-shen-kong-jian</w:t>
       </w:r>
-      <w:proofErr w:type="gramStart"/>
+      <w:proofErr w:type="spellEnd"/>
       <w:r>
-        <w:rPr>
-          <w:rStyle w:val="af2"/>
-        </w:rPr>
-        <w:t>tech.github</w:t>
+        <w:t>/</w:t>
       </w:r>
-      <w:proofErr w:type="gramEnd"/>
-      <w:r>
-        <w:rPr>
-          <w:rStyle w:val="af2"/>
-        </w:rPr>
-        <w:t>.iozhu-she</w:t>
-      </w:r>
-      <w:r>
-        <w:rPr>
-          <w:rStyle w:val="af2"/>
-        </w:rPr>
-        <w:t>n</w:t>
-      </w:r>
-      <w:r>
-        <w:rPr>
-          <w:rStyle w:val="af2"/>
-        </w:rPr>
-        <w:t>-kong-jian</w:t>
-      </w:r>
-      <w:r>
-        <w:rPr>
-          <w:rFonts w:hint="eastAsia"/>
-        </w:rPr>
-        <w:fldChar w:fldCharType="end"/>
-      </w:r>
-    </w:p>
-    <w:p>
-      <w:pPr>
-        <w:rPr>
-          <w:rFonts w:hint="eastAsia"/>
-        </w:rPr>
-      </w:pPr>
     </w:p>
     <w:sectPr>
       <w:pgSz w:w="11906" w:h="16838"/>
@@ -745,7 +700,6 @@
   <w:style w:type="character" w:default="1" w:styleId="a0">
     <w:name w:val="Default Paragraph Font"/>
     <w:uiPriority w:val="1"/>
-    <w:semiHidden/>
     <w:unhideWhenUsed/>
   </w:style>
   <w:style w:type="table" w:default="1" w:styleId="a1">

</xml_diff>